<commit_message>
Docs: update manual and demo guide to v1.0.3
Co-Authored-By: Claude Sonnet 5.5 <noreply@anthropic.com>
</commit_message>
<xml_diff>
--- a/docs/PATCHWORK_Demo_Guide.docx
+++ b/docs/PATCHWORK_Demo_Guide.docx
@@ -53,7 +53,7 @@
           <w:sz w:val="26"/>
           <w:szCs w:val="26"/>
         </w:rPr>
-        <w:t xml:space="preserve">Everything you need to understand every feature — and to show it with confidence.</w:t>
+        <w:t xml:space="preserve">Everything you need to understand every feature — and to show it with confidence.  (PATCHWORK prototype v1.0.3 · 11 October 2026)</w:t>
       </w:r>
     </w:p>
     <w:tbl>
@@ -1997,7 +1997,7 @@
                 <w:sz w:val="19"/>
                 <w:szCs w:val="19"/>
               </w:rPr>
-              <w:t xml:space="preserve">confidence with which patches re-attached after the site was redesigned (new ids, classes, structure)</w:t>
+              <w:t xml:space="preserve">locator confidence in the ShopLite demo, when the checkout button re-attached after the v2 redesign (new ids, classes, structure) — a figure from this one scenario, not a benchmark</w:t>
             </w:r>
           </w:p>
         </w:tc>
@@ -2067,7 +2067,7 @@
                 <w:sz w:val="19"/>
                 <w:szCs w:val="19"/>
               </w:rPr>
-              <w:t xml:space="preserve">17+</w:t>
+              <w:t xml:space="preserve">7 types</w:t>
             </w:r>
           </w:p>
         </w:tc>
@@ -2100,7 +2100,7 @@
                 <w:sz w:val="19"/>
                 <w:szCs w:val="19"/>
               </w:rPr>
-              <w:t xml:space="preserve">automated checks in one verification run (patch apply, flows, console, accessibility, visual, blast radius — desktop and mobile)</w:t>
+              <w:t xml:space="preserve">of automated check in each verification run (patch apply, critical flows, console, network, accessibility, visual, blast radius — desktop and mobile; the count of individual checks grows with pages and patches)</w:t>
             </w:r>
           </w:p>
         </w:tc>
@@ -8917,7 +8917,7 @@
                 <w:sz w:val="19"/>
                 <w:szCs w:val="19"/>
               </w:rPr>
-              <w:t xml:space="preserve">The Overview page: live release, patch counts, errors and self-heals in the last minute, tracking status, recent activity.</w:t>
+              <w:t xml:space="preserve">The Overview page: a welcome strip with three big buttons beside the patch pipeline, live release, patch counts, errors and self-heals in the last minute, tracking status, and the last five recent-activity events at the bottom.</w:t>
             </w:r>
           </w:p>
         </w:tc>
@@ -17798,7 +17798,7 @@
         <w:sz w:val="17"/>
         <w:szCs w:val="17"/>
       </w:rPr>
-      <w:t xml:space="preserve">Hotfix the Internet</w:t>
+      <w:t xml:space="preserve">Hotfix the Internet · v1.0.3</w:t>
     </w:r>
     <w:r>
       <w:rPr>

</xml_diff>